<commit_message>
Search refinement and updated labels
</commit_message>
<xml_diff>
--- a/archivist-backend/app/templates/box_label_template.docx
+++ b/archivist-backend/app/templates/box_label_template.docx
@@ -1,6 +1,6 @@
 
 <file path=word/document.xml><?xml version="1.0" encoding="utf-8"?>
-<w:document xmlns:wpc="http://schemas.microsoft.com/office/word/2010/wordprocessingCanvas" xmlns:cx="http://schemas.microsoft.com/office/drawing/2014/chartex" xmlns:cx1="http://schemas.microsoft.com/office/drawing/2015/9/8/chartex" xmlns:cx2="http://schemas.microsoft.com/office/drawing/2015/10/21/chartex" xmlns:cx3="http://schemas.microsoft.com/office/drawing/2016/5/9/chartex" xmlns:cx4="http://schemas.microsoft.com/office/drawing/2016/5/10/chartex" xmlns:cx5="http://schemas.microsoft.com/office/drawing/2016/5/11/chartex" xmlns:cx6="http://schemas.microsoft.com/office/drawing/2016/5/12/chartex" xmlns:cx7="http://schemas.microsoft.com/office/drawing/2016/5/13/chartex" xmlns:cx8="http://schemas.microsoft.com/office/drawing/2016/5/14/chartex" xmlns:mc="http://schemas.openxmlformats.org/markup-compatibility/2006" xmlns:aink="http://schemas.microsoft.com/office/drawing/2016/ink" xmlns:am3d="http://schemas.microsoft.com/office/drawing/2017/model3d" xmlns:o="urn:schemas-microsoft-com:office:office" xmlns:oel="http://schemas.microsoft.com/office/2019/extlst" xmlns:r="http://schemas.openxmlformats.org/officeDocument/2006/relationships" xmlns:m="http://schemas.openxmlformats.org/officeDocument/2006/math" xmlns:v="urn:schemas-microsoft-com:vml" xmlns:wp14="http://schemas.microsoft.com/office/word/2010/wordprocessingDrawing" xmlns:wp="http://schemas.openxmlformats.org/drawingml/2006/wordprocessingDrawing" xmlns:w10="urn:schemas-microsoft-com:office:word" xmlns:w="http://schemas.openxmlformats.org/wordprocessingml/2006/main" xmlns:w14="http://schemas.microsoft.com/office/word/2010/wordml" xmlns:w15="http://schemas.microsoft.com/office/word/2012/wordml" xmlns:w16cex="http://schemas.microsoft.com/office/word/2018/wordml/cex" xmlns:w16cid="http://schemas.microsoft.com/office/word/2016/wordml/cid" xmlns:w16="http://schemas.microsoft.com/office/word/2018/wordml" xmlns:w16sdtdh="http://schemas.microsoft.com/office/word/2020/wordml/sdtdatahash" xmlns:w16se="http://schemas.microsoft.com/office/word/2015/wordml/symex" xmlns:wpg="http://schemas.microsoft.com/office/word/2010/wordprocessingGroup" xmlns:wpi="http://schemas.microsoft.com/office/word/2010/wordprocessingInk" xmlns:wne="http://schemas.microsoft.com/office/word/2006/wordml" xmlns:wps="http://schemas.microsoft.com/office/word/2010/wordprocessingShape" mc:Ignorable="w14 w15 w16se w16cid w16 w16cex w16sdtdh wp14">
+<w:document xmlns:wpc="http://schemas.microsoft.com/office/word/2010/wordprocessingCanvas" xmlns:cx="http://schemas.microsoft.com/office/drawing/2014/chartex" xmlns:cx1="http://schemas.microsoft.com/office/drawing/2015/9/8/chartex" xmlns:cx2="http://schemas.microsoft.com/office/drawing/2015/10/21/chartex" xmlns:cx3="http://schemas.microsoft.com/office/drawing/2016/5/9/chartex" xmlns:cx4="http://schemas.microsoft.com/office/drawing/2016/5/10/chartex" xmlns:cx5="http://schemas.microsoft.com/office/drawing/2016/5/11/chartex" xmlns:cx6="http://schemas.microsoft.com/office/drawing/2016/5/12/chartex" xmlns:cx7="http://schemas.microsoft.com/office/drawing/2016/5/13/chartex" xmlns:cx8="http://schemas.microsoft.com/office/drawing/2016/5/14/chartex" xmlns:mc="http://schemas.openxmlformats.org/markup-compatibility/2006" xmlns:aink="http://schemas.microsoft.com/office/drawing/2016/ink" xmlns:am3d="http://schemas.microsoft.com/office/drawing/2017/model3d" xmlns:o="urn:schemas-microsoft-com:office:office" xmlns:oel="http://schemas.microsoft.com/office/2019/extlst" xmlns:r="http://schemas.openxmlformats.org/officeDocument/2006/relationships" xmlns:m="http://schemas.openxmlformats.org/officeDocument/2006/math" xmlns:v="urn:schemas-microsoft-com:vml" xmlns:wp14="http://schemas.microsoft.com/office/word/2010/wordprocessingDrawing" xmlns:wp="http://schemas.openxmlformats.org/drawingml/2006/wordprocessingDrawing" xmlns:w10="urn:schemas-microsoft-com:office:word" xmlns:w="http://schemas.openxmlformats.org/wordprocessingml/2006/main" xmlns:w14="http://schemas.microsoft.com/office/word/2010/wordml" xmlns:w15="http://schemas.microsoft.com/office/word/2012/wordml" xmlns:w16cex="http://schemas.microsoft.com/office/word/2018/wordml/cex" xmlns:w16cid="http://schemas.microsoft.com/office/word/2016/wordml/cid" xmlns:w16="http://schemas.microsoft.com/office/word/2018/wordml" xmlns:w16du="http://schemas.microsoft.com/office/word/2023/wordml/word16du" xmlns:w16sdtdh="http://schemas.microsoft.com/office/word/2020/wordml/sdtdatahash" xmlns:w16sdtfl="http://schemas.microsoft.com/office/word/2024/wordml/sdtformatlock" xmlns:w16se="http://schemas.microsoft.com/office/word/2015/wordml/symex" xmlns:wpg="http://schemas.microsoft.com/office/word/2010/wordprocessingGroup" xmlns:wpi="http://schemas.microsoft.com/office/word/2010/wordprocessingInk" xmlns:wne="http://schemas.microsoft.com/office/word/2006/wordml" xmlns:wps="http://schemas.microsoft.com/office/word/2010/wordprocessingShape" mc:Ignorable="w14 w15 w16se w16cid w16 w16cex w16sdtdh w16sdtfl w16du wp14">
   <w:body>
     <w:tbl>
       <w:tblPr>
@@ -26,7 +26,6 @@
         <w:tc>
           <w:tcPr>
             <w:tcW w:w="5618" w:type="dxa"/>
-            <w:shd w:val="clear" w:color="auto" w:fill="auto"/>
           </w:tcPr>
           <w:tbl>
             <w:tblPr>
@@ -44,14 +43,13 @@
             </w:tblGrid>
             <w:tr>
               <w:trPr>
-                <w:trHeight w:val="714"/>
+                <w:trHeight w:val="1274"/>
                 <w:jc w:val="center"/>
               </w:trPr>
               <w:tc>
                 <w:tcPr>
                   <w:tcW w:w="5574" w:type="dxa"/>
                   <w:gridSpan w:val="2"/>
-                  <w:shd w:val="clear" w:color="auto" w:fill="auto"/>
                 </w:tcPr>
                 <w:p>
                   <w:pPr>
@@ -64,15 +62,23 @@
                     </w:rPr>
                   </w:pPr>
                   <w:r>
+                    <w:rPr>
+                      <w:sz w:val="48"/>
+                      <w:szCs w:val="44"/>
+                    </w:rPr>
                     <w:t>{{code_1}}</w:t>
                   </w:r>
                   <w:r>
+                    <w:rPr>
+                      <w:sz w:val="48"/>
+                      <w:szCs w:val="44"/>
+                    </w:rPr>
                     <w:br/>
                   </w:r>
                   <w:r>
                     <w:rPr>
-                      <w:sz w:val="20"/>
-                      <w:szCs w:val="18"/>
+                      <w:sz w:val="40"/>
+                      <w:szCs w:val="36"/>
                     </w:rPr>
                     <w:t>{{name_1}}</w:t>
                   </w:r>
@@ -87,7 +93,6 @@
               <w:tc>
                 <w:tcPr>
                   <w:tcW w:w="2784" w:type="dxa"/>
-                  <w:shd w:val="clear" w:color="auto" w:fill="auto"/>
                   <w:vAlign w:val="center"/>
                 </w:tcPr>
                 <w:p>
@@ -114,7 +119,6 @@
               <w:tc>
                 <w:tcPr>
                   <w:tcW w:w="2790" w:type="dxa"/>
-                  <w:shd w:val="clear" w:color="auto" w:fill="auto"/>
                   <w:vAlign w:val="center"/>
                 </w:tcPr>
                 <w:p>
@@ -147,7 +151,6 @@
                   <w:tcBorders>
                     <w:bottom w:val="single" w:sz="4" w:space="0" w:color="auto"/>
                   </w:tcBorders>
-                  <w:shd w:val="clear" w:color="auto" w:fill="auto"/>
                   <w:vAlign w:val="center"/>
                 </w:tcPr>
                 <w:p>
@@ -172,7 +175,6 @@
               <w:tc>
                 <w:tcPr>
                   <w:tcW w:w="2790" w:type="dxa"/>
-                  <w:shd w:val="clear" w:color="auto" w:fill="auto"/>
                   <w:vAlign w:val="center"/>
                 </w:tcPr>
                 <w:p>
@@ -207,7 +209,6 @@
                     <w:bottom w:val="nil"/>
                     <w:right w:val="nil"/>
                   </w:tcBorders>
-                  <w:shd w:val="clear" w:color="auto" w:fill="auto"/>
                   <w:vAlign w:val="center"/>
                 </w:tcPr>
                 <w:p>
@@ -235,7 +236,6 @@
                   <w:tcBorders>
                     <w:left w:val="nil"/>
                   </w:tcBorders>
-                  <w:shd w:val="clear" w:color="auto" w:fill="auto"/>
                   <w:vAlign w:val="center"/>
                 </w:tcPr>
                 <w:p>
@@ -324,7 +324,6 @@
         <w:tc>
           <w:tcPr>
             <w:tcW w:w="144" w:type="dxa"/>
-            <w:shd w:val="clear" w:color="auto" w:fill="auto"/>
           </w:tcPr>
           <w:p>
             <w:pPr>
@@ -335,7 +334,6 @@
         <w:tc>
           <w:tcPr>
             <w:tcW w:w="5618" w:type="dxa"/>
-            <w:shd w:val="clear" w:color="auto" w:fill="auto"/>
           </w:tcPr>
           <w:tbl>
             <w:tblPr>
@@ -353,14 +351,13 @@
             </w:tblGrid>
             <w:tr>
               <w:trPr>
-                <w:trHeight w:val="714"/>
+                <w:trHeight w:val="1274"/>
                 <w:jc w:val="center"/>
               </w:trPr>
               <w:tc>
                 <w:tcPr>
                   <w:tcW w:w="5574" w:type="dxa"/>
                   <w:gridSpan w:val="2"/>
-                  <w:shd w:val="clear" w:color="auto" w:fill="auto"/>
                 </w:tcPr>
                 <w:p>
                   <w:pPr>
@@ -373,15 +370,23 @@
                     </w:rPr>
                   </w:pPr>
                   <w:r>
+                    <w:rPr>
+                      <w:sz w:val="48"/>
+                      <w:szCs w:val="44"/>
+                    </w:rPr>
                     <w:t>{{code_2}}</w:t>
                   </w:r>
                   <w:r>
+                    <w:rPr>
+                      <w:sz w:val="48"/>
+                      <w:szCs w:val="44"/>
+                    </w:rPr>
                     <w:br/>
                   </w:r>
                   <w:r>
                     <w:rPr>
-                      <w:sz w:val="20"/>
-                      <w:szCs w:val="18"/>
+                      <w:sz w:val="40"/>
+                      <w:szCs w:val="36"/>
                     </w:rPr>
                     <w:t>{{name_2}}</w:t>
                   </w:r>
@@ -396,7 +401,6 @@
               <w:tc>
                 <w:tcPr>
                   <w:tcW w:w="2784" w:type="dxa"/>
-                  <w:shd w:val="clear" w:color="auto" w:fill="auto"/>
                   <w:vAlign w:val="center"/>
                 </w:tcPr>
                 <w:p>
@@ -423,7 +427,6 @@
               <w:tc>
                 <w:tcPr>
                   <w:tcW w:w="2790" w:type="dxa"/>
-                  <w:shd w:val="clear" w:color="auto" w:fill="auto"/>
                   <w:vAlign w:val="center"/>
                 </w:tcPr>
                 <w:p>
@@ -456,7 +459,6 @@
                   <w:tcBorders>
                     <w:bottom w:val="single" w:sz="4" w:space="0" w:color="auto"/>
                   </w:tcBorders>
-                  <w:shd w:val="clear" w:color="auto" w:fill="auto"/>
                   <w:vAlign w:val="center"/>
                 </w:tcPr>
                 <w:p>
@@ -481,7 +483,6 @@
               <w:tc>
                 <w:tcPr>
                   <w:tcW w:w="2790" w:type="dxa"/>
-                  <w:shd w:val="clear" w:color="auto" w:fill="auto"/>
                   <w:vAlign w:val="center"/>
                 </w:tcPr>
                 <w:p>
@@ -516,7 +517,6 @@
                     <w:bottom w:val="nil"/>
                     <w:right w:val="nil"/>
                   </w:tcBorders>
-                  <w:shd w:val="clear" w:color="auto" w:fill="auto"/>
                   <w:vAlign w:val="center"/>
                 </w:tcPr>
                 <w:p>
@@ -544,7 +544,6 @@
                   <w:tcBorders>
                     <w:left w:val="nil"/>
                   </w:tcBorders>
-                  <w:shd w:val="clear" w:color="auto" w:fill="auto"/>
                   <w:vAlign w:val="center"/>
                 </w:tcPr>
                 <w:p>
@@ -582,7 +581,6 @@
         <w:tc>
           <w:tcPr>
             <w:tcW w:w="5618" w:type="dxa"/>
-            <w:shd w:val="clear" w:color="auto" w:fill="auto"/>
           </w:tcPr>
           <w:tbl>
             <w:tblPr>
@@ -600,14 +598,13 @@
             </w:tblGrid>
             <w:tr>
               <w:trPr>
-                <w:trHeight w:val="714"/>
+                <w:trHeight w:val="1276"/>
                 <w:jc w:val="center"/>
               </w:trPr>
               <w:tc>
                 <w:tcPr>
                   <w:tcW w:w="5574" w:type="dxa"/>
                   <w:gridSpan w:val="2"/>
-                  <w:shd w:val="clear" w:color="auto" w:fill="auto"/>
                 </w:tcPr>
                 <w:p>
                   <w:pPr>
@@ -620,15 +617,23 @@
                     </w:rPr>
                   </w:pPr>
                   <w:r>
+                    <w:rPr>
+                      <w:sz w:val="48"/>
+                      <w:szCs w:val="44"/>
+                    </w:rPr>
                     <w:t>{{code_3}}</w:t>
                   </w:r>
                   <w:r>
+                    <w:rPr>
+                      <w:sz w:val="48"/>
+                      <w:szCs w:val="44"/>
+                    </w:rPr>
                     <w:br/>
                   </w:r>
                   <w:r>
                     <w:rPr>
-                      <w:sz w:val="20"/>
-                      <w:szCs w:val="18"/>
+                      <w:sz w:val="40"/>
+                      <w:szCs w:val="36"/>
                     </w:rPr>
                     <w:t>{{name_3}}</w:t>
                   </w:r>
@@ -643,7 +648,6 @@
               <w:tc>
                 <w:tcPr>
                   <w:tcW w:w="2784" w:type="dxa"/>
-                  <w:shd w:val="clear" w:color="auto" w:fill="auto"/>
                   <w:vAlign w:val="center"/>
                 </w:tcPr>
                 <w:p>
@@ -670,7 +674,6 @@
               <w:tc>
                 <w:tcPr>
                   <w:tcW w:w="2790" w:type="dxa"/>
-                  <w:shd w:val="clear" w:color="auto" w:fill="auto"/>
                   <w:vAlign w:val="center"/>
                 </w:tcPr>
                 <w:p>
@@ -703,7 +706,6 @@
                   <w:tcBorders>
                     <w:bottom w:val="single" w:sz="4" w:space="0" w:color="auto"/>
                   </w:tcBorders>
-                  <w:shd w:val="clear" w:color="auto" w:fill="auto"/>
                   <w:vAlign w:val="center"/>
                 </w:tcPr>
                 <w:p>
@@ -728,7 +730,6 @@
               <w:tc>
                 <w:tcPr>
                   <w:tcW w:w="2790" w:type="dxa"/>
-                  <w:shd w:val="clear" w:color="auto" w:fill="auto"/>
                   <w:vAlign w:val="center"/>
                 </w:tcPr>
                 <w:p>
@@ -763,7 +764,6 @@
                     <w:bottom w:val="nil"/>
                     <w:right w:val="nil"/>
                   </w:tcBorders>
-                  <w:shd w:val="clear" w:color="auto" w:fill="auto"/>
                   <w:vAlign w:val="center"/>
                 </w:tcPr>
                 <w:p>
@@ -791,7 +791,6 @@
                   <w:tcBorders>
                     <w:left w:val="nil"/>
                   </w:tcBorders>
-                  <w:shd w:val="clear" w:color="auto" w:fill="auto"/>
                   <w:vAlign w:val="center"/>
                 </w:tcPr>
                 <w:p>
@@ -824,7 +823,6 @@
         <w:tc>
           <w:tcPr>
             <w:tcW w:w="144" w:type="dxa"/>
-            <w:shd w:val="clear" w:color="auto" w:fill="auto"/>
           </w:tcPr>
           <w:p>
             <w:pPr>
@@ -835,7 +833,6 @@
         <w:tc>
           <w:tcPr>
             <w:tcW w:w="5618" w:type="dxa"/>
-            <w:shd w:val="clear" w:color="auto" w:fill="auto"/>
           </w:tcPr>
           <w:tbl>
             <w:tblPr>
@@ -853,14 +850,13 @@
             </w:tblGrid>
             <w:tr>
               <w:trPr>
-                <w:trHeight w:val="714"/>
+                <w:trHeight w:val="1276"/>
                 <w:jc w:val="center"/>
               </w:trPr>
               <w:tc>
                 <w:tcPr>
                   <w:tcW w:w="5574" w:type="dxa"/>
                   <w:gridSpan w:val="2"/>
-                  <w:shd w:val="clear" w:color="auto" w:fill="auto"/>
                 </w:tcPr>
                 <w:p>
                   <w:pPr>
@@ -873,15 +869,23 @@
                     </w:rPr>
                   </w:pPr>
                   <w:r>
+                    <w:rPr>
+                      <w:sz w:val="48"/>
+                      <w:szCs w:val="44"/>
+                    </w:rPr>
                     <w:t>{{code_4}}</w:t>
                   </w:r>
                   <w:r>
+                    <w:rPr>
+                      <w:sz w:val="48"/>
+                      <w:szCs w:val="44"/>
+                    </w:rPr>
                     <w:br/>
                   </w:r>
                   <w:r>
                     <w:rPr>
-                      <w:sz w:val="20"/>
-                      <w:szCs w:val="18"/>
+                      <w:sz w:val="40"/>
+                      <w:szCs w:val="36"/>
                     </w:rPr>
                     <w:t>{{name_4}}</w:t>
                   </w:r>
@@ -896,7 +900,6 @@
               <w:tc>
                 <w:tcPr>
                   <w:tcW w:w="2784" w:type="dxa"/>
-                  <w:shd w:val="clear" w:color="auto" w:fill="auto"/>
                   <w:vAlign w:val="center"/>
                 </w:tcPr>
                 <w:p>
@@ -923,7 +926,6 @@
               <w:tc>
                 <w:tcPr>
                   <w:tcW w:w="2790" w:type="dxa"/>
-                  <w:shd w:val="clear" w:color="auto" w:fill="auto"/>
                   <w:vAlign w:val="center"/>
                 </w:tcPr>
                 <w:p>
@@ -956,7 +958,6 @@
                   <w:tcBorders>
                     <w:bottom w:val="single" w:sz="4" w:space="0" w:color="auto"/>
                   </w:tcBorders>
-                  <w:shd w:val="clear" w:color="auto" w:fill="auto"/>
                   <w:vAlign w:val="center"/>
                 </w:tcPr>
                 <w:p>
@@ -981,7 +982,6 @@
               <w:tc>
                 <w:tcPr>
                   <w:tcW w:w="2790" w:type="dxa"/>
-                  <w:shd w:val="clear" w:color="auto" w:fill="auto"/>
                   <w:vAlign w:val="center"/>
                 </w:tcPr>
                 <w:p>
@@ -1016,7 +1016,6 @@
                     <w:bottom w:val="nil"/>
                     <w:right w:val="nil"/>
                   </w:tcBorders>
-                  <w:shd w:val="clear" w:color="auto" w:fill="auto"/>
                   <w:vAlign w:val="center"/>
                 </w:tcPr>
                 <w:p>
@@ -1044,7 +1043,6 @@
                   <w:tcBorders>
                     <w:left w:val="nil"/>
                   </w:tcBorders>
-                  <w:shd w:val="clear" w:color="auto" w:fill="auto"/>
                   <w:vAlign w:val="center"/>
                 </w:tcPr>
                 <w:p>
@@ -1097,7 +1095,7 @@
 </file>
 
 <file path=word/styles.xml><?xml version="1.0" encoding="utf-8"?>
-<w:styles xmlns:mc="http://schemas.openxmlformats.org/markup-compatibility/2006" xmlns:r="http://schemas.openxmlformats.org/officeDocument/2006/relationships" xmlns:w="http://schemas.openxmlformats.org/wordprocessingml/2006/main" xmlns:w14="http://schemas.microsoft.com/office/word/2010/wordml" xmlns:w15="http://schemas.microsoft.com/office/word/2012/wordml" xmlns:w16cex="http://schemas.microsoft.com/office/word/2018/wordml/cex" xmlns:w16cid="http://schemas.microsoft.com/office/word/2016/wordml/cid" xmlns:w16="http://schemas.microsoft.com/office/word/2018/wordml" xmlns:w16sdtdh="http://schemas.microsoft.com/office/word/2020/wordml/sdtdatahash" xmlns:w16se="http://schemas.microsoft.com/office/word/2015/wordml/symex" mc:Ignorable="w14 w15 w16se w16cid w16 w16cex w16sdtdh">
+<w:styles xmlns:mc="http://schemas.openxmlformats.org/markup-compatibility/2006" xmlns:r="http://schemas.openxmlformats.org/officeDocument/2006/relationships" xmlns:w="http://schemas.openxmlformats.org/wordprocessingml/2006/main" xmlns:w14="http://schemas.microsoft.com/office/word/2010/wordml" xmlns:w15="http://schemas.microsoft.com/office/word/2012/wordml" xmlns:w16cex="http://schemas.microsoft.com/office/word/2018/wordml/cex" xmlns:w16cid="http://schemas.microsoft.com/office/word/2016/wordml/cid" xmlns:w16="http://schemas.microsoft.com/office/word/2018/wordml" xmlns:w16du="http://schemas.microsoft.com/office/word/2023/wordml/word16du" xmlns:w16sdtdh="http://schemas.microsoft.com/office/word/2020/wordml/sdtdatahash" xmlns:w16sdtfl="http://schemas.microsoft.com/office/word/2024/wordml/sdtformatlock" xmlns:w16se="http://schemas.microsoft.com/office/word/2015/wordml/symex" mc:Ignorable="w14 w15 w16se w16cid w16 w16cex w16sdtdh w16sdtfl w16du">
   <w:docDefaults>
     <w:rPrDefault>
       <w:rPr>

</xml_diff>